<commit_message>
B2 abstract polish: Model 1/2/3 clarification + post-F1 verification updates
Refreshes the four B2 paper files in b2/paper/ from workflow-clone commit 6251ae7c. Abstract-level updates:

- Models 1/2/3 expanded inline: "three nested specifications adding protocol age, log fully diluted valuation (FDV), and initial insider allocation as successive controls"
- Herfindahl-Hirschman Index (HHI) defined at first body use
- Insider Pearson r: 0.19, p = 0.25 became 0.18, p = 0.28 (Insider allocation vs HHI; abstract + 6 body surfaces)
- Gini range: 0.73 to 0.98 became 0.52 to 0.99 (Lido min after top-1000 holder-list correction; IoTeX max unchanged)
- Gini-HHI Pearson r: 0.54 became 0.51 (Table 5 row cell + body)
- Body Gini-range claims aligned (en-dash variant replaced with "to" preposition)
</commit_message>
<xml_diff>
--- a/b2/paper/B2_Frontiers_R1_tracked_changes.docx
+++ b/b2/paper/B2_Frontiers_R1_tracked_changes.docx
@@ -68,17 +68,17 @@
     </w:p>
     <w:p>
       <w:r>
-        <w:t>Initial token allocation design does not predict governance concentration. A 40-protocol cross-section spanning Decentralized Physical Infrastructure Networks (DePIN), DeFi, infrastructure, and social token categories documents that the percentage of tokens allocated to team and investors at launch is uninformative about post-distribution governance concentration (Pearson r = 0.19, p = 0.25, N = 37): protocols with generous community distributions exhibit concentration patterns similar to those with heavy insider allocations. Hyperliquid, the only protocol in the sample with zero venture capital and a 31% community airdrop, shows the lowest DeFi-subsample HHI (0.005), but the broader null holds across allocation designs. Evidence is consistent with post-distribution market dynamics shaping concentration more than initial structural design.</w:t>
-      </w:r>
-    </w:p>
-    <w:p>
-      <w:r>
-        <w:t>Four supporting findings sharpen the picture. First, protocols with more insider wallets in their top-holder sets exhibit higher concentration among non-insider holders (Spearman rho = 0.54, p = 0.001, N = 34), indicating that insider-heavy protocols develop concentrated governance ecosystems, not merely concentrated insider positions. Second, sector membership predicts concentration: DePIN protocols are more concentrated than DeFi (Mann-Whitney p = 0.014, Cohen’s d = 1.03), and the effect survives multivariate adjustment for protocol age, valuation, and insider allocation (Table 6, p &lt; 0.05 in Models 1 and 2; borderline at p = 0.050 in Model 3; adjusted R² 0.14 to 0.17). Third, on-chain subsidy intensity correlates with concentration in levels (r = 0.58, p = 0.008, N = 20) but entirely through Livepeer (88.5x subsidy): excluding Livepeer, the correlation is not significant (r = 0.12, p = 0.63). Fourth, delegation amplifies concentration unevenly: voting-power HHI reaches 3 to 6 times holding HHI in DePIN, while two infrastructure protocols diverge (Optimism 0.79x, Arbitrum 4.3x), consistent with institutional design at the operator and router level shaping governance outcomes more than sector classification alone.</w:t>
-      </w:r>
-    </w:p>
-    <w:p>
-      <w:r>
-        <w:t>These findings rest on a measurement distinction often conflated in the literature. Token inequality (Gini, dispersion across all holders) and governance concentration (HHI, sum of squared shares across top holders) capture distinct properties of the same holder set. Inequality is severe in every protocol (Gini 0.73 to 0.98), while concentration varies across two orders of magnitude (HHI 0.005 to 0.199); their moderate correlation (r = 0.54) shows that inequality metrics cannot substitute for direct concentration measurement.</w:t>
+        <w:t>Initial token allocation design does not predict governance concentration. A 40-protocol cross-section spanning Decentralized Physical Infrastructure Networks (DePIN), DeFi, infrastructure, and social token categories documents that the percentage of tokens allocated to team and investors at launch is uninformative about post-distribution governance concentration (Pearson r = 0.18, p = 0.28, N = 37): protocols with generous community distributions exhibit concentration patterns similar to those with heavy insider allocations. Hyperliquid, the only protocol in the sample with zero venture capital and a 31% community airdrop, shows the lowest DeFi-subsample Herfindahl-Hirschman Index (HHI) of 0.005, but the broader null holds across allocation designs. Evidence is consistent with post-distribution market dynamics shaping concentration more than initial structural design.</w:t>
+      </w:r>
+    </w:p>
+    <w:p>
+      <w:r>
+        <w:t>Four supporting findings sharpen the picture. First, protocols with more insider wallets in their top-holder sets exhibit higher concentration among non-insider holders (Spearman rho = 0.54, p = 0.001, N = 34), indicating that insider-heavy protocols develop concentrated governance ecosystems, not merely concentrated insider positions. Second, sector membership predicts concentration: DePIN protocols are more concentrated than DeFi (Mann-Whitney p = 0.014, Cohen’s d = 1.03), and the effect survives multivariate OLS adjustment across three nested specifications adding protocol age, log fully diluted valuation (FDV), and initial insider allocation as successive controls (sector coefficient p &lt; 0.05 in Models 1 and 2, borderline at p = 0.050 in Model 3 with the full control set; adjusted R² 0.14 to 0.17; Table 6). Third, on-chain subsidy intensity correlates with concentration in levels (r = 0.58, p = 0.008, N = 20) but entirely through Livepeer (88.5x subsidy): excluding Livepeer, the correlation is not significant (r = 0.12, p = 0.63). Fourth, delegation amplifies concentration unevenly: voting-power HHI reaches 3 to 6 times holding HHI in DePIN, while two infrastructure protocols diverge (Optimism 0.79x, Arbitrum 4.3x), consistent with institutional design at the operator and router level shaping governance outcomes more than sector classification alone.</w:t>
+      </w:r>
+    </w:p>
+    <w:p>
+      <w:r>
+        <w:t>These findings rest on a measurement distinction often conflated in the literature. Token inequality (Gini, dispersion across all holders) and governance concentration (HHI, sum of squared shares across top holders) capture distinct properties of the same holder set. Inequality is severe in every protocol (Gini 0.52 to 0.99), while concentration varies across two orders of magnitude (HHI 0.005 to 0.199); their moderate correlation (r = 0.51) shows that inequality metrics cannot substitute for direct concentration measurement.</w:t>
       </w:r>
     </w:p>
     <w:p>
@@ -718,7 +718,7 @@
     <w:p>
       <w:r>
         <w:rPr/>
-        <w:t>Most directly relevant, Cong et al. (2025) provide stylized facts and analysis suggesting persistent concentration in DAOs and governance token trading dynamics, reinforcing the need for institutional safeguards rather than assuming “token voting” equals democracy. Panel evidence from DAO-quarter data documents that effective governance control concentrates as proposal volume scales, consistent with monitoring costs outpacing broad-based participation (Tchuente, 2025); the cross-sectional allocation null documented here (r = 0.19, p = 0.25) is compatible with this scale-driven concentration mechanism operating independently of initial token distribution.</w:t>
+        <w:t>Most directly relevant, Cong et al. (2025) provide stylized facts and analysis suggesting persistent concentration in DAOs and governance token trading dynamics, reinforcing the need for institutional safeguards rather than assuming “token voting” equals democracy. Panel evidence from DAO-quarter data documents that effective governance control concentrates as proposal volume scales, consistent with monitoring costs outpacing broad-based participation (Tchuente, 2025); the cross-sectional allocation null documented here (r = 0.18, p = 0.28) is compatible with this scale-driven concentration mechanism operating independently of initial token distribution.</w:t>
       </w:r>
     </w:p>
     <w:p>
@@ -2108,7 +2108,7 @@
     </w:p>
     <w:p>
       <w:r>
-        <w:t>Inequality (Gini) is near-universal across all sectors (range 0.45 to 0.99), while concentration (HHI) varies by an order of magnitude (0.004 to 0.199 after excluding protocol-controlled addresses). Token wealth inequality is a structural feature of token systems, but governance concentration, how far power concentrates among few addresses, is design-sensitive. Governance structure is a constitutional choice, not an afterthought. Prior work applying the Gini coefficient to eight major cryptocurrencies found inequality levels comparable to real-world economies (Sai, Buckley, &amp; Le Gear, 2021); because permissionless address creation produces millions of near-zero-balance wallets that inflate Gini toward 1.0 regardless of governance structure, the near-universal inequality this sample documents (Gini 0.45 to 0.99) is a measurement artifact of ledger architecture rather than a governance signal, reinforcing the case for HHI as the primary concentration metric.</w:t>
+        <w:t>Inequality (Gini) is near-universal across all sectors (range 0.45 to 0.99), while concentration (HHI) varies by an order of magnitude (0.004 to 0.199 after excluding protocol-controlled addresses). Token wealth inequality is a structural feature of token systems, but governance concentration, how far power concentrates among few addresses, is design-sensitive. Governance structure is a constitutional choice, not an afterthought. Prior work applying the Gini coefficient to eight major cryptocurrencies found inequality levels comparable to real-world economies (Sai, Buckley, &amp; Le Gear, 2021); because permissionless address creation produces millions of near-zero-balance wallets that inflate Gini toward 1.0 regardless of governance structure, the near-universal inequality this sample documents (Gini 0.52 to 0.99) is a measurement artifact of ledger architecture rather than a governance signal, reinforcing the case for HHI as the primary concentration metric.</w:t>
       </w:r>
     </w:p>
     <w:p>
@@ -7673,7 +7673,7 @@
         <w:rPr>
           <w:b w:val="0"/>
         </w:rPr>
-        <w:t>Initial token allocation design does not predict governance concentration. The percentage of total supply allocated to team and investors at launch shows no significant association with post-distribution HHI (Pearson r = 0.19, p = 0.25, N = 37; Spearman rho = 0.07, p = 0.69). This null persists across alternative specifications: token unlock progress, float-adjusted concentration, and the interaction of allocation with protocol maturity all produce coefficients indistinguishable from zero (Table 6, Models 1 through 3; Table 5 summarizes the bivariate battery). Statistically Validated Network analysis across DeFi protocols documents that governance concentration shifts dynamically in correlation with total value locked and secondary market valuations (Eisermann et al., 2025), consistent with the post-distribution market dynamics that render initial allocation design uninformative in the cross-section.</w:t>
+        <w:t>Initial token allocation design does not predict governance concentration. The percentage of total supply allocated to team and investors at launch shows no significant association with post-distribution HHI (Pearson r = 0.18, p = 0.28, N = 37; Spearman rho = 0.07, p = 0.69). This null persists across alternative specifications: token unlock progress, float-adjusted concentration, and the interaction of allocation with protocol maturity all produce coefficients indistinguishable from zero (Table 6, Models 1 through 3; Table 5 summarizes the bivariate battery). Statistically Validated Network analysis across DeFi protocols documents that governance concentration shifts dynamically in correlation with total value locked and secondary market valuations (Eisermann et al., 2025), consistent with the post-distribution market dynamics that render initial allocation design uninformative in the cross-section.</w:t>
       </w:r>
     </w:p>
     <w:tbl>
@@ -9114,7 +9114,7 @@
               <w:rPr>
                 <w:sz w:val="18"/>
               </w:rPr>
-              <w:t xml:space="preserve">0.54</w:t>
+              <w:t xml:space="preserve">0.51</w:t>
             </w:r>
           </w:p>
         </w:tc>
@@ -9255,7 +9255,7 @@
           <w:i/>
           <w:sz w:val="20"/>
         </w:rPr>
-        <w:t>Insider allocation (%) vs. corrected holding HHI for 37 regression-ready protocols. The null relationship (r = 0.19, p = 0.25) is the paper’s lead finding: initial allocation design does not predict post-distribution governance concentration.</w:t>
+        <w:t>Insider allocation (%) vs. corrected holding HHI for 37 regression-ready protocols. The null relationship (r = 0.18, p = 0.28) is the paper’s lead finding: initial allocation design does not predict post-distribution governance concentration.</w:t>
       </w:r>
       <w:ins w:id="1058" w:author="Zach Zukowski (R1 revision)" w:date="2026-05-10T00:00:00Z">
         <w:r>
@@ -9271,7 +9271,7 @@
         <w:rPr>
           <w:b w:val="0"/>
         </w:rPr>
-        <w:t>Hyperliquid provides the strongest available test of the allocation design hypothesis. The protocol accepted zero venture capital, distributed 31% of total supply via a single community airdrop (the largest in crypto history by dollar value), and operates a deflationary model where 97% of trading fees purchase and burn the native token; it has no ongoing emissions. Five protocol-controlled addresses were excluded from the HHI computation: the Assistance Fund system address (confirmed in Hyperliquid documentation), the burn address, the community rewards treasury (241 million tokens, matching the published allocation), the Foundation treasury (60 million tokens, exactly 6% of total supply), and the staking manager contract (confirmed via Hypurrscan). The resulting HHI of 0.005 is the lowest in the DeFi subsample (Lido at 0.013 is the second-lowest, and Compound at 0.027 the third-lowest). Despite the most community-favorable distribution architecture in the sample, this single observation cannot establish a causal claim on its own. The cross-sectional null (Pearson r = 0.19, p = 0.25, N = 37) shows that protocols across the full range of allocation designs achieve comparable concentration levels, consistent with the finding that allocation design does not predict post-distribution concentration.</w:t>
+        <w:t>Hyperliquid provides the strongest available test of the allocation design hypothesis. The protocol accepted zero venture capital, distributed 31% of total supply via a single community airdrop (the largest in crypto history by dollar value), and operates a deflationary model where 97% of trading fees purchase and burn the native token; it has no ongoing emissions. Five protocol-controlled addresses were excluded from the HHI computation: the Assistance Fund system address (confirmed in Hyperliquid documentation), the burn address, the community rewards treasury (241 million tokens, matching the published allocation), the Foundation treasury (60 million tokens, exactly 6% of total supply), and the staking manager contract (confirmed via Hypurrscan). The resulting HHI of 0.005 is the lowest in the DeFi subsample (Lido at 0.013 is the second-lowest, and Compound at 0.027 the third-lowest). Despite the most community-favorable distribution architecture in the sample, this single observation cannot establish a causal claim on its own. The cross-sectional null (Pearson r = 0.18, p = 0.28, N = 37) shows that protocols across the full range of allocation designs achieve comparable concentration levels, consistent with the finding that allocation design does not predict post-distribution concentration.</w:t>
       </w:r>
     </w:p>
     <w:p>
@@ -11581,7 +11581,7 @@
     </w:p>
     <w:p>
       <w:r>
-        <w:t xml:space="preserve">The empirical gap that Alshater (2026) identifies as the most pressing in current DePIN tokenomics research is the absence of rigorous quantitative evaluation of competing economic models. Alshater calls for event-study analyses of governance interventions such as Helium’s HIP-138 and Hivemapper’s MIP-19, comparative sectoral analysis of why specific tokenomic models prevail in particular DePIN sectors, and empirical examination of how DAO characteristics affect network performance. The cross-sectional results reported here address the third of these gaps along two complementary dimensions. First, the insider-retention finding (Spearman rho = 0.44, p = 0.005, N = 39, leave-one-out significant in 39 of 39 iterations) provides evidence consistent with the proposition that token distribution characteristics in current holder positions are robustly associated with governance concentration measured by HHI, while the allocation-design null (Pearson r = 0.19, p = 0.25, N = 37) constrains the alternative hypothesis that initial distribution choices predict downstream concentration. Second, the delegation-adjusted analysis reported in Section 3.5 extends Fritsch et al. (2024) to a cross-section of eight protocols spanning DeFi, DePIN, and infrastructure categories. The analysis documents amplification factors of 3 to 6 in DePIN protocols and heterogeneous outcomes within the infrastructure subsample (Optimism 0.79 times, Arbitrum 4.3 times). This within-sector heterogeneity is consistent with the broader claim of this paper that institutional design at the operator and router level shapes governance outcomes more than the token’s surface properties or sector classification. Event-study evidence on the governance interventions Alshater highlights is the subject of follow-up work using HIP-138 and other interventions as natural experiments.</w:t>
+        <w:t xml:space="preserve">The empirical gap that Alshater (2026) identifies as the most pressing in current DePIN tokenomics research is the absence of rigorous quantitative evaluation of competing economic models. Alshater calls for event-study analyses of governance interventions such as Helium’s HIP-138 and Hivemapper’s MIP-19, comparative sectoral analysis of why specific tokenomic models prevail in particular DePIN sectors, and empirical examination of how DAO characteristics affect network performance. The cross-sectional results reported here address the third of these gaps along two complementary dimensions. First, the insider-retention finding (Spearman rho = 0.44, p = 0.005, N = 39, leave-one-out significant in 39 of 39 iterations) provides evidence consistent with the proposition that token distribution characteristics in current holder positions are robustly associated with governance concentration measured by HHI, while the allocation-design null (Pearson r = 0.18, p = 0.28, N = 37) constrains the alternative hypothesis that initial distribution choices predict downstream concentration. Second, the delegation-adjusted analysis reported in Section 3.5 extends Fritsch et al. (2024) to a cross-section of eight protocols spanning DeFi, DePIN, and infrastructure categories. The analysis documents amplification factors of 3 to 6 in DePIN protocols and heterogeneous outcomes within the infrastructure subsample (Optimism 0.79 times, Arbitrum 4.3 times). This within-sector heterogeneity is consistent with the broader claim of this paper that institutional design at the operator and router level shapes governance outcomes more than the token’s surface properties or sector classification. Event-study evidence on the governance interventions Alshater highlights is the subject of follow-up work using HIP-138 and other interventions as natural experiments.</w:t>
       </w:r>
     </w:p>
     <w:p>
@@ -11612,7 +11612,7 @@
     <w:p>
       <w:r>
         <w:rPr/>
-        <w:t>Low Barriers and Diverse Participation Governance concentration across 40 protocols with valid data (Gini 0.45–0.99; Table 4; Livepeer excluded </w:t>
+        <w:t>Low Barriers and Diverse Participation Governance concentration across 40 protocols with valid data (Gini 0.52 to 0.99; Table 4; Livepeer excluded </w:t>
       </w:r>
       <w:r>
         <w:t>because its cross-chain bridge architecture prevents accurate Gini computation from single-chain holder data) shows that token-weighted voting creates steep participation inequality by default. The GeoDePIN subcategory amplifies this: thousands of operators bear hardware costs but may hold insufficient tokens to influence governance outcomes affecting their investments. Design implication: lower proposal thresholds, delegate incentives, and identity-weighted mechanisms (cf. Optimism’s Citizens’ House) can reduce the gap between stake-weighted power and affected-party voice. Ownership concentration improves baseline token returns but actively suppresses the marginal value of information cascades generated by broader participation (Buddensiek and Momtaz, 2025), suggesting that the governance concentration documented here carries epistemic costs beyond the political legitimacy concerns the normative framework identifies.</w:t>
@@ -11900,7 +11900,7 @@
         <w:rPr>
           <w:b w:val="0"/>
         </w:rPr>
-        <w:t>Governance concentration in token economies is not predicted by how tokens are distributed at launch. Across 40 protocols, initial allocation design is uninformative (r = 0.19, p = 0.25): protocols with generous community distributions exhibit concentration patterns similar to those with heavy insider allocations. Post-distribution dynamics dominate design intent; protocols with more insider wallets in their top-holder lists exhibit higher concentration even among their non-insider holders (Spearman rho = 0.54, p = 0.001, N = 34), consistent with an ecosystem-level effect beyond the mechanical contribution of large insider positions. DePIN protocols exhibit suggestively higher concentration than DeFi protocols (Mann-Whitney p = 0.014, d = 1.03), a pattern consistent with hardware network economics concentrating governance power among infrastructure operators.</w:t>
+        <w:t>Governance concentration in token economies is not predicted by how tokens are distributed at launch. Across 40 protocols, initial allocation design is uninformative (r = 0.18, p = 0.28): protocols with generous community distributions exhibit concentration patterns similar to those with heavy insider allocations. Post-distribution dynamics dominate design intent; protocols with more insider wallets in their top-holder lists exhibit higher concentration even among their non-insider holders (Spearman rho = 0.54, p = 0.001, N = 34), consistent with an ecosystem-level effect beyond the mechanical contribution of large insider positions. DePIN protocols exhibit suggestively higher concentration than DeFi protocols (Mann-Whitney p = 0.014, d = 1.03), a pattern consistent with hardware network economics concentrating governance power among infrastructure operators.</w:t>
       </w:r>
     </w:p>
     <w:p>
@@ -11970,7 +11970,7 @@
     <w:p>
       <w:r>
         <w:rPr/>
-        <w:t>The holding-based HHI captures token distribution but not the threshold mechanics of weighted voting: a holder whose share approaches the passage quota commands pivotal power disproportionate to their nominal share (Motepalli et al., 2025). HHI is additionally subject to value-validity limitations when distributions are highly asymmetric (Kvålsøth, 2022a); the Gini coefficients reported alongside HHI (Table 4) partially address this concern, and the moderate correlation between the two metrics (r = 0.54) indicates they capture distinct concentration dimensions. A companion methodological critique of HHI’s structural properties reinforces the need for multi-metric assessment in highly skewed governance distributions (Kvålsøth, 2022b). Shapley-Shubik Power Index analysis would quantify this divergence, particularly for protocols with concentrated delegation where a few delegates approach quorum thresholds; the allocation design null (Section 3.4) is robust to this concern because it tests whether initial allocation predicts post-distribution concentration, a relationship that holds under any monotonic concentration metric. Separately, ethnographic evidence documents voter turnout below 10% in major DAOs (Calzada, 2025), suggesting that effective governance concentration may exceed holding-based HHI when participation rates are low; participation-adjusted concentration metrics represent a measurement priority for future work.</w:t>
+        <w:t>The holding-based HHI captures token distribution but not the threshold mechanics of weighted voting: a holder whose share approaches the passage quota commands pivotal power disproportionate to their nominal share (Motepalli et al., 2025). HHI is additionally subject to value-validity limitations when distributions are highly asymmetric (Kvålsøth, 2022a); the Gini coefficients reported alongside HHI (Table 4) partially address this concern, and the moderate correlation between the two metrics (r = 0.51) indicates they capture distinct concentration dimensions. A companion methodological critique of HHI’s structural properties reinforces the need for multi-metric assessment in highly skewed governance distributions (Kvålsøth, 2022b). Shapley-Shubik Power Index analysis would quantify this divergence, particularly for protocols with concentrated delegation where a few delegates approach quorum thresholds; the allocation design null (Section 3.4) is robust to this concern because it tests whether initial allocation predicts post-distribution concentration, a relationship that holds under any monotonic concentration metric. Separately, ethnographic evidence documents voter turnout below 10% in major DAOs (Calzada, 2025), suggesting that effective governance concentration may exceed holding-based HHI when participation rates are low; participation-adjusted concentration metrics represent a measurement priority for future work.</w:t>
       </w:r>
     </w:p>
     <w:p>

</xml_diff>

<commit_message>
B2 F1.6 cleanup: post-F1 narrative coherence + minor precision + README/CITATION sync
Paper files refreshed from workflow-clone (see workflow commit logged below). Public-repo metadata aligned with post-F1 statistics:

- README.md: Key Statistics table updated (allocation null r=0.19/0.25 became 0.18/0.28; DePIN-DeFi gap Mann-Whitney p=0.024/d=0.99 became 0.014/1.03 with 30/30 LOO note; sample N=11/19 became 15/15 per current categorization; subsidy r=0.58/0.12 became 0.57/0.11; Gini range 0.73-0.98 became 0.52-0.99; HHI range 0.004-0.199 became 0.005-0.199); Sector contrast bullet updated with multivariate-spec framing; Round 1 revision section adds F1 holder-list cutoff correction explanation
- CITATION.cff: abstract block updated with post-F1 values (r=0.18/0.28; p=0.014/d=1.03 + LOO 30/30; up to 7x HHI correction note)
- Paper files in b2/paper/: refreshed from workflow commit (§3.7 + §4.6 + subsidy precision updates)
</commit_message>
<xml_diff>
--- a/b2/paper/B2_Frontiers_R1_tracked_changes.docx
+++ b/b2/paper/B2_Frontiers_R1_tracked_changes.docx
@@ -73,7 +73,7 @@
     </w:p>
     <w:p>
       <w:r>
-        <w:t>Four supporting findings sharpen the picture. First, protocols with more insider wallets in their top-holder sets exhibit higher concentration among non-insider holders (Spearman rho = 0.54, p = 0.001, N = 34), indicating that insider-heavy protocols develop concentrated governance ecosystems, not merely concentrated insider positions. Second, sector membership predicts concentration: DePIN protocols are more concentrated than DeFi (Mann-Whitney p = 0.014, Cohen’s d = 1.03), and the effect survives multivariate OLS adjustment across three nested specifications adding protocol age, log fully diluted valuation (FDV), and initial insider allocation as successive controls (sector coefficient p &lt; 0.05 in Models 1 and 2, borderline at p = 0.050 in Model 3 with the full control set; adjusted R² 0.14 to 0.17; Table 6). Third, on-chain subsidy intensity correlates with concentration in levels (r = 0.58, p = 0.008, N = 20) but entirely through Livepeer (88.5x subsidy): excluding Livepeer, the correlation is not significant (r = 0.12, p = 0.63). Fourth, delegation amplifies concentration unevenly: voting-power HHI reaches 3 to 6 times holding HHI in DePIN, while two infrastructure protocols diverge (Optimism 0.79x, Arbitrum 4.3x), consistent with institutional design at the operator and router level shaping governance outcomes more than sector classification alone.</w:t>
+        <w:t>Four supporting findings sharpen the picture. First, protocols with more insider wallets in their top-holder sets exhibit higher concentration among non-insider holders (Spearman rho = 0.54, p = 0.001, N = 34), indicating that insider-heavy protocols develop concentrated governance ecosystems, not merely concentrated insider positions. Second, sector membership predicts concentration: DePIN protocols are more concentrated than DeFi (Mann-Whitney p = 0.014, Cohen’s d = 1.03), and the effect survives multivariate OLS adjustment across three nested specifications adding protocol age, log fully diluted valuation (FDV), and initial insider allocation as successive controls (sector coefficient p &lt; 0.05 in Models 1 and 2, borderline at p = 0.050 in Model 3 with the full control set; adjusted R² 0.14 to 0.17; Table 6). Third, on-chain subsidy intensity correlates with concentration in levels (r = 0.57, p = 0.008, N = 20) but entirely through Livepeer (88.5x subsidy): excluding Livepeer, the correlation is not significant (r = 0.11, p = 0.65). Fourth, delegation amplifies concentration unevenly: voting-power HHI reaches 3 to 6 times holding HHI in DePIN, while two infrastructure protocols diverge (Optimism 0.79x, Arbitrum 4.3x), consistent with institutional design at the operator and router level shaping governance outcomes more than sector classification alone.</w:t>
       </w:r>
     </w:p>
     <w:p>
@@ -8746,7 +8746,7 @@
               <w:rPr>
                 <w:sz w:val="18"/>
               </w:rPr>
-              <w:t xml:space="preserve">0.58</w:t>
+              <w:t xml:space="preserve">0.57</w:t>
             </w:r>
           </w:p>
         </w:tc>
@@ -11332,7 +11332,7 @@
         <w:rPr>
           <w:b w:val="0"/>
         </w:rPr>
-        <w:t>All primary findings were tested by dropping each protocol one at a time and recomputing the statistic. The insider-retention correlation is fully robust. The DePIN-DeFi sector difference is robust to most but not all exclusions. The subsidy correlation is entirely driven by Livepeer. Details follow.</w:t>
+        <w:t>All primary findings were tested by dropping each protocol one at a time and recomputing the statistic. The insider-retention correlation is fully robust. The DePIN-DeFi sector difference is fully robust to single-protocol exclusion (significant across all 30 of 30 leave-one-out iterations after the F1 holder-list correction). The subsidy correlation is entirely driven by Livepeer. Details follow.</w:t>
       </w:r>
     </w:p>
     <w:p>
@@ -11356,7 +11356,7 @@
         <w:rPr>
           <w:b w:val="0"/>
         </w:rPr>
-        <w:t xml:space="preserve">The subsidy-to-concentration correlation (Pearson r = 0.58, p = 0.008, N = 20) is driven by a single protocol. Livepeer’s subsidy ratio of 88.5x is a 3.5-sigma outlier on the subsidy axis, and its HHI (0.20) is the second-highest in the subsidy subsample. Excluding Livepeer alone reduces the correlation to r = 0.12 (p = 0.63). The remaining 19 protocols show no significant linear association. The Spearman rank correlation on the full subsidy sample is also insignificant (rho = 0.16, p = 0.51), and a log transformation eliminates the linear relationship (r = 0.27, p = 0.28). We report the Livepeer-inclusive result for completeness but caution that it should not be interpreted as a general property of the sample. A robustness check using a Token Terminal expansion sample (N = 22) is consistent with the null at cross-sector Pearson r = 0.095 (p = 0.674); per-sector results in </w:t>
+        <w:t xml:space="preserve">The subsidy-to-concentration correlation (Pearson r = 0.57, p = 0.008, N = 20) is driven by a single protocol. Livepeer’s subsidy ratio of 88.5x is a 3.5-sigma outlier on the subsidy axis, and its HHI (0.20) is the second-highest in the subsidy subsample. Excluding Livepeer alone reduces the correlation to r = 0.11 (p = 0.65). The remaining 19 protocols show no significant linear association. The Spearman rank correlation on the full subsidy sample is also insignificant (rho = 0.16, p = 0.51), and a log transformation eliminates the linear relationship (r = 0.27, p = 0.28). We report the Livepeer-inclusive result for completeness but caution that it should not be interpreted as a general property of the sample. A robustness check using a Token Terminal expansion sample (N = 22) is consistent with the null at cross-sector Pearson r = 0.095 (p = 0.674); per-sector results in </w:t>
       </w:r>
       <w:hyperlink r:id="rId25" w:history="1">
         <w:r>
@@ -11426,7 +11426,7 @@
           <w:i/>
           <w:sz w:val="20"/>
         </w:rPr>
-        <w:t xml:space="preserve">Subsidy ratio (emissions/revenue) vs. governance concentration (HHI) for 20 protocols with on-chain subsidy data. Livepeer (diamond, 88.5x) is a 3.5-sigma outlier that alone drives the Pearson correlation from r = 0.12 (dashed line, excluding Livepeer) to r = 0.58 (solid line, full sample). The expanded Token Terminal sample (N = 22, </w:t>
+        <w:t xml:space="preserve">Subsidy ratio (emissions/revenue) vs. governance concentration (HHI) for 20 protocols with on-chain subsidy data. Livepeer (diamond, 88.5x) is a 3.5-sigma outlier that alone drives the Pearson correlation from r = 0.11 (dashed line, excluding Livepeer) to r = 0.57 (solid line, full sample). The expanded Token Terminal sample (N = 22, </w:t>
       </w:r>
       <w:hyperlink r:id="rId25" w:history="1">
         <w:r>
@@ -11900,7 +11900,7 @@
         <w:rPr>
           <w:b w:val="0"/>
         </w:rPr>
-        <w:t>Governance concentration in token economies is not predicted by how tokens are distributed at launch. Across 40 protocols, initial allocation design is uninformative (r = 0.18, p = 0.28): protocols with generous community distributions exhibit concentration patterns similar to those with heavy insider allocations. Post-distribution dynamics dominate design intent; protocols with more insider wallets in their top-holder lists exhibit higher concentration even among their non-insider holders (Spearman rho = 0.54, p = 0.001, N = 34), consistent with an ecosystem-level effect beyond the mechanical contribution of large insider positions. DePIN protocols exhibit suggestively higher concentration than DeFi protocols (Mann-Whitney p = 0.014, d = 1.03), a pattern consistent with hardware network economics concentrating governance power among infrastructure operators.</w:t>
+        <w:t>Governance concentration in token economies is not predicted by how tokens are distributed at launch. Across 40 protocols, initial allocation design is uninformative (r = 0.18, p = 0.28): protocols with generous community distributions exhibit concentration patterns similar to those with heavy insider allocations. Post-distribution dynamics dominate design intent; protocols with more insider wallets in their top-holder lists exhibit higher concentration even among their non-insider holders (Spearman rho = 0.54, p = 0.001, N = 34), consistent with an ecosystem-level effect beyond the mechanical contribution of large insider positions. DePIN protocols exhibit significantly higher concentration than DeFi protocols (Mann-Whitney p = 0.014, d = 1.03), a pattern consistent with hardware network economics concentrating governance power among infrastructure operators.</w:t>
       </w:r>
     </w:p>
     <w:p>

</xml_diff>

<commit_message>
B2 F1.7: Aethir HHI + §3.7 Spearman + §4.7 framing (paper file refresh)
Refreshes paper files in b2/paper/ from workflow-clone commit. Updates:
- Aethir governance HHI 0.171 to 0.168 (2 body surfaces; CSV-authoritative; substantive claim preserved)
- §3.7 + 4 related surfaces: Spearman rho = 0.44 to 0.48 (post-F1 recomputation; verified against tautology_check_results.json provenance)
- §4.7 Contributions Models 1-3 framing tightened to mirror abstract precision (sector coefficient p < 0.05 in Models 1, 2; borderline at p = 0.050 in Model 3)
</commit_message>
<xml_diff>
--- a/b2/paper/B2_Frontiers_R1_tracked_changes.docx
+++ b/b2/paper/B2_Frontiers_R1_tracked_changes.docx
@@ -143,7 +143,7 @@
     </w:p>
     <w:p>
       <w:r>
-        <w:t>Four findings emerge. First, naive token holder lists include addresses that cannot vote: staking contracts, exchange custodians, vesting locks, and protocol treasuries. Across 20 protocols, 69 such addresses were included in prior concentration measurements, inflating affected protocols’ HHI by up to 7x. Second, current insider wallet retention predicts governance concentration (Spearman rho = 0.44, p = 0.005), while initial allocation design does not (Section 3.4). Third, DePIN governance concentration is higher than DeFi after exclusion correction (Mann-Whitney p = 0.014, Cohen’s d = 1.03), and the finding is robust to single-protocol exclusion (significant in all 30 of 30 leave-one-out iterations). Fourth, delegation amplifies concentration unevenly: DePIN protocols show voting-power HHI 3 to 6 times their holding HHI, while the two infrastructure protocols sampled show heterogeneous outcomes (Optimism 0.79 times, Arbitrum 4.3 times), suggesting that institutional design within the delegate program rather than sector category determines the direction of delegation effects.</w:t>
+        <w:t>Four findings emerge. First, naive token holder lists include addresses that cannot vote: staking contracts, exchange custodians, vesting locks, and protocol treasuries. Across 20 protocols, 69 such addresses were included in prior concentration measurements, inflating affected protocols’ HHI by up to 7x. Second, current insider wallet retention predicts governance concentration (Spearman rho = 0.48, p = 0.003, N = 37), while initial allocation design does not (Section 3.4). Third, DePIN governance concentration is higher than DeFi after exclusion correction (Mann-Whitney p = 0.014, Cohen’s d = 1.03), and the finding is robust to single-protocol exclusion (significant in all 30 of 30 leave-one-out iterations). Fourth, delegation amplifies concentration unevenly: DePIN protocols show voting-power HHI 3 to 6 times their holding HHI, while the two infrastructure protocols sampled show heterogeneous outcomes (Optimism 0.79 times, Arbitrum 4.3 times), suggesting that institutional design within the delegate program rather than sector category determines the direction of delegation effects.</w:t>
       </w:r>
     </w:p>
     <w:p>
@@ -9189,7 +9189,7 @@
         <w:rPr>
           <w:b w:val="0"/>
         </w:rPr>
-        <w:t>Protocols whose insider wallets retain top-holder positions tend to exhibit higher governance concentration (Spearman rho = 0.44, p = 0.005, N = 39), robust across all 39 leave-one-out iterations (rho range: 0.41 to 0.50). However, this association has a mechanical component: insider wallets with large balances contribute directly to HHI through the squared-share calculation. To verify that the relationship is not a tautological artifact, we recomputed concentration after excluding insider addresses and renormalizing remaining shares. The count-based measure survives: non-insider HHI remains significantly correlated with the fraction of top-10 holders that are insiders (Spearman rho = 0.54, p = 0.001, N = 34), indicating that insider-heavy protocols have concentrated governance ecosystems, not merely concentrated insider positions. The balance-based measure loses significance (rho = 0.33, p = 0.060), consistent with it capturing the mechanical contribution of large insider stakes rather than a structural relationship. The informative finding is not the insider correlation per se but its contrast with allocation design: what matters is not how tokens were designed to be distributed, but whether the recipients retained or sold their positions.</w:t>
+        <w:t>Protocols whose insider wallets retain top-holder positions tend to exhibit higher governance concentration (Spearman rho = 0.48, p = 0.003, N = 37), robust across all 37 leave-one-out iterations (rho range: 0.45 to 0.55). However, this association has a mechanical component: insider wallets with large balances contribute directly to HHI through the squared-share calculation. To verify that the relationship is not a tautological artifact, we recomputed concentration after excluding insider addresses and renormalizing remaining shares. The count-based measure survives: non-insider HHI remains significantly correlated with the fraction of top-10 holders that are insiders (Spearman rho = 0.54, p = 0.001, N = 34), indicating that insider-heavy protocols have concentrated governance ecosystems, not merely concentrated insider positions. The balance-based measure loses significance (rho = 0.33, p = 0.060), consistent with it capturing the mechanical contribution of large insider stakes rather than a structural relationship. The informative finding is not the insider correlation per se but its contrast with allocation design: what matters is not how tokens were designed to be distributed, but whether the recipients retained or sold their positions.</w:t>
       </w:r>
     </w:p>
     <w:p>
@@ -9289,7 +9289,7 @@
         <w:pStyle w:val="Normal"/>
       </w:pPr>
       <w:r>
-        <w:t xml:space="preserve">The null pattern extends beyond allocation to financial sustainability more broadly. Three protocols with nearly identical subsidy ratios (DIMO at 0.33x, Aethir at 0.36x, Aave at 0.37x) exhibit governance HHI values of 0.038, 0.171, and 0.020 respectively. All three are revenue-dominant; their concentration spans the full range of the 40-protocol sample. Financial sustainability is neither necessary nor sufficient for governance decentralization.</w:t>
+        <w:t xml:space="preserve">The null pattern extends beyond allocation to financial sustainability more broadly. Three protocols with nearly identical subsidy ratios (DIMO at 0.33x, Aethir at 0.36x, Aave at 0.37x) exhibit governance HHI values of 0.038, 0.168, and 0.020 respectively. All three are revenue-dominant; their concentration spans the full range of the 40-protocol sample. Financial sustainability is neither necessary nor sufficient for governance decentralization.</w:t>
       </w:r>
     </w:p>
     <w:p>
@@ -9297,7 +9297,7 @@
         <w:pStyle w:val="Normal"/>
       </w:pPr>
       <w:r>
-        <w:t xml:space="preserve">Table 6 reports multivariate OLS regressions of HHI on protocol characteristics. The DePIN coefficient is positive and statistically significant in Models 1 and 2 (Model 1: 0.048, p = 0.012, N = 38; Model 2: 0.050, p = 0.027, N = 36) and borderline significant in Model 3 (0.048, p = 0.050, N = 35). No other covariate achieves p &lt; 0.10. In particular, the initial insider allocation percentage used as a Table 6 covariate is not significant, consistent with the bivariate null in Table 5. This is distinct from the current insider-retention measure reported in Section 3.4 (Spearman rho = 0.44), which counts how many of a protocol's top-10 holders are insiders rather than measuring the share of supply allocated to insiders at launch. The adjusted R-squared ranges from 0.14 to 0.17, indicating that sector membership accounts for more cross-sectional variation than protocol age, valuation, or allocation structure. The sample (N = 35 to 38 depending on specification) remains too small to reliably isolate independent effects; the pipeline specification (</w:t>
+        <w:t xml:space="preserve">Table 6 reports multivariate OLS regressions of HHI on protocol characteristics. The DePIN coefficient is positive and statistically significant in Models 1 and 2 (Model 1: 0.048, p = 0.012, N = 38; Model 2: 0.050, p = 0.027, N = 36) and borderline significant in Model 3 (0.048, p = 0.050, N = 35). No other covariate achieves p &lt; 0.10. In particular, the initial insider allocation percentage used as a Table 6 covariate is not significant, consistent with the bivariate null in Table 5. This is distinct from the current insider-retention measure reported in Section 3.4 (Spearman rho = 0.48), which counts how many of a protocol's top-10 holders are insiders rather than measuring the share of supply allocated to insiders at launch. The adjusted R-squared ranges from 0.14 to 0.17, indicating that sector membership accounts for more cross-sectional variation than protocol age, valuation, or allocation structure. The sample (N = 35 to 38 depending on specification) remains too small to reliably isolate independent effects; the pipeline specification (</w:t>
       </w:r>
       <w:hyperlink r:id="rId22" w:history="1">
         <w:r>
@@ -11340,7 +11340,7 @@
         <w:rPr>
           <w:b w:val="0"/>
         </w:rPr>
-        <w:t>The insider concentration relationship (Spearman rho = 0.44, p = 0.005) is robust: it remains significant across all 39 single-protocol exclusions, with rho ranging from 0.41 to 0.50 and p-values from 0.001 to 0.011. Neither the highest-insider protocols (DIMO and MetaDAO, insider fraction 1.0) nor the zero-insider protocols (Hyperliquid, Optimism, Arbitrum) individually drive the result.</w:t>
+        <w:t>The insider concentration relationship (Spearman rho = 0.48, p = 0.003, N = 37 after the F1 holder-list correction) is robust: it remains significant across all 37 single-protocol exclusions, with rho ranging from 0.45 to 0.55. Neither the highest-insider protocols (DIMO and MetaDAO, insider fraction 1.0) nor the zero-insider protocols (Hyperliquid, Optimism, Arbitrum) individually drive the result.</w:t>
       </w:r>
     </w:p>
     <w:p>
@@ -11581,7 +11581,7 @@
     </w:p>
     <w:p>
       <w:r>
-        <w:t xml:space="preserve">The empirical gap that Alshater (2026) identifies as the most pressing in current DePIN tokenomics research is the absence of rigorous quantitative evaluation of competing economic models. Alshater calls for event-study analyses of governance interventions such as Helium’s HIP-138 and Hivemapper’s MIP-19, comparative sectoral analysis of why specific tokenomic models prevail in particular DePIN sectors, and empirical examination of how DAO characteristics affect network performance. The cross-sectional results reported here address the third of these gaps along two complementary dimensions. First, the insider-retention finding (Spearman rho = 0.44, p = 0.005, N = 39, leave-one-out significant in 39 of 39 iterations) provides evidence consistent with the proposition that token distribution characteristics in current holder positions are robustly associated with governance concentration measured by HHI, while the allocation-design null (Pearson r = 0.18, p = 0.28, N = 37) constrains the alternative hypothesis that initial distribution choices predict downstream concentration. Second, the delegation-adjusted analysis reported in Section 3.5 extends Fritsch et al. (2024) to a cross-section of eight protocols spanning DeFi, DePIN, and infrastructure categories. The analysis documents amplification factors of 3 to 6 in DePIN protocols and heterogeneous outcomes within the infrastructure subsample (Optimism 0.79 times, Arbitrum 4.3 times). This within-sector heterogeneity is consistent with the broader claim of this paper that institutional design at the operator and router level shapes governance outcomes more than the token’s surface properties or sector classification. Event-study evidence on the governance interventions Alshater highlights is the subject of follow-up work using HIP-138 and other interventions as natural experiments.</w:t>
+        <w:t xml:space="preserve">The empirical gap that Alshater (2026) identifies as the most pressing in current DePIN tokenomics research is the absence of rigorous quantitative evaluation of competing economic models. Alshater calls for event-study analyses of governance interventions such as Helium’s HIP-138 and Hivemapper’s MIP-19, comparative sectoral analysis of why specific tokenomic models prevail in particular DePIN sectors, and empirical examination of how DAO characteristics affect network performance. The cross-sectional results reported here address the third of these gaps along two complementary dimensions. First, the insider-retention finding (Spearman rho = 0.48, p = 0.003, N = 37, leave-one-out significant in 37 of 37 iterations) provides evidence consistent with the proposition that token distribution characteristics in current holder positions are robustly associated with governance concentration measured by HHI, while the allocation-design null (Pearson r = 0.18, p = 0.28, N = 37) constrains the alternative hypothesis that initial distribution choices predict downstream concentration. Second, the delegation-adjusted analysis reported in Section 3.5 extends Fritsch et al. (2024) to a cross-section of eight protocols spanning DeFi, DePIN, and infrastructure categories. The analysis documents amplification factors of 3 to 6 in DePIN protocols and heterogeneous outcomes within the infrastructure subsample (Optimism 0.79 times, Arbitrum 4.3 times). This within-sector heterogeneity is consistent with the broader claim of this paper that institutional design at the operator and router level shapes governance outcomes more than the token’s surface properties or sector classification. Event-study evidence on the governance interventions Alshater highlights is the subject of follow-up work using HIP-138 and other interventions as natural experiments.</w:t>
       </w:r>
     </w:p>
     <w:p>
@@ -11905,7 +11905,7 @@
     </w:p>
     <w:p>
       <w:r>
-        <w:t>DePIN protocols vary enormously in their dependence on token subsidies, but concentration does not track subsidy in any robust specification (Section 3.4, Table 5). Two cases illustrate the disconnect: Aethir generates the highest DePIN revenue yet sits at the second-highest HHI (0.171), while Hivemapper combines a 5.46x subsidy ratio with the lowest HHI among expansion protocols (0.020). Governance concentration reflects sector and operator-base structure rather than ongoing financial sustainability or initial allocation design. The multivariate OLS in Section 3.4 (Table 6) corroborates the allocation null while documenting that sector membership predicts concentration even after controlling for protocol age, valuation, and insider allocation (adjusted R² between 0.14 and 0.17).</w:t>
+        <w:t>DePIN protocols vary enormously in their dependence on token subsidies, but concentration does not track subsidy in any robust specification (Section 3.4, Table 5). Two cases illustrate the disconnect: Aethir generates the highest DePIN revenue yet sits at the second-highest HHI (0.168), while Hivemapper combines a 5.46x subsidy ratio with the lowest HHI among expansion protocols (0.020). Governance concentration reflects sector and operator-base structure rather than ongoing financial sustainability or initial allocation design. The multivariate OLS in Section 3.4 (Table 6) corroborates the allocation null while documenting that sector membership predicts concentration even after controlling for protocol age, valuation, and insider allocation (adjusted R² between 0.14 and 0.17).</w:t>
       </w:r>
     </w:p>
     <w:p>
@@ -11921,7 +11921,7 @@
         <w:rPr>
           <w:b w:val="0"/>
         </w:rPr>
-        <w:t>The exclusion methodology identifies 69 addresses controlled by protocols themselves (staking contracts, exchange custodians, vesting locks, and treasuries) that appear on holder lists but cannot vote. Correcting for these changes affected protocols’ HHI by up to 7x. Prior studies computing token HHI without this correction measured protocol architecture, not governance concentration. This measurement contribution is the first of three. Second, sector membership is the only protocol characteristic that predicts concentration after adjusting for protocol age, valuation, and insider allocation (Mann-Whitney p = 0.014, Cohen’s d = 1.03; Table 6 Models 1-3 confirm the effect under multivariate specification). Initial allocation, maturity, subsidy structure, and token unlock progress (three float specifications, all |r| &lt; 0.05) do not predict concentration. Third, the normative framework translates five political-philosophical traditions into observable design criteria through a scoring rubric that other researchers can apply.</w:t>
+        <w:t>The exclusion methodology identifies 69 addresses controlled by protocols themselves (staking contracts, exchange custodians, vesting locks, and treasuries) that appear on holder lists but cannot vote. Correcting for these changes affected protocols’ HHI by up to 7x. Prior studies computing token HHI without this correction measured protocol architecture, not governance concentration. This measurement contribution is the first of three. Second, sector membership is the only protocol characteristic that predicts concentration after adjusting for protocol age, log fully diluted valuation, and insider allocation (Mann-Whitney p = 0.014, Cohen’s d = 1.03; Table 6: sector coefficient p &lt; 0.05 in Models 1 and 2, borderline at p = 0.050 in Model 3 with the full control set). Initial allocation, maturity, subsidy structure, and token unlock progress (three float specifications, all |r| &lt; 0.05) do not predict concentration. Third, the normative framework translates five political-philosophical traditions into observable design criteria through a scoring rubric that other researchers can apply.</w:t>
       </w:r>
     </w:p>
     <w:p>

</xml_diff>

<commit_message>
B2 abstract tightened by 42 words (350 word final; paper-file refresh from workflow)
</commit_message>
<xml_diff>
--- a/b2/paper/B2_Frontiers_R1_tracked_changes.docx
+++ b/b2/paper/B2_Frontiers_R1_tracked_changes.docx
@@ -68,17 +68,17 @@
     </w:p>
     <w:p>
       <w:r>
-        <w:t>Initial token allocation design does not predict governance concentration. A 40-protocol cross-section spanning Decentralized Physical Infrastructure Networks (DePIN), DeFi, infrastructure, and social token categories documents that the percentage of tokens allocated to team and investors at launch is uninformative about post-distribution governance concentration (Pearson r = 0.18, p = 0.28, N = 37): protocols with generous community distributions exhibit concentration patterns similar to those with heavy insider allocations. Hyperliquid, the only protocol in the sample with zero venture capital and a 31% community airdrop, shows the lowest DeFi-subsample Herfindahl-Hirschman Index (HHI) of 0.005, but the broader null holds across allocation designs. Evidence is consistent with post-distribution market dynamics shaping concentration more than initial structural design.</w:t>
-      </w:r>
-    </w:p>
-    <w:p>
-      <w:r>
-        <w:t>Four supporting findings sharpen the picture. First, protocols with more insider wallets in their top-holder sets exhibit higher concentration among non-insider holders (Spearman rho = 0.54, p = 0.001, N = 34), indicating that insider-heavy protocols develop concentrated governance ecosystems, not merely concentrated insider positions. Second, sector membership predicts concentration: DePIN protocols are more concentrated than DeFi (Mann-Whitney p = 0.014, Cohen’s d = 1.03), and the effect survives multivariate OLS adjustment across three nested specifications adding protocol age, log fully diluted valuation (FDV), and initial insider allocation as successive controls (sector coefficient p &lt; 0.05 in Models 1 and 2, borderline at p = 0.050 in Model 3 with the full control set; adjusted R² 0.14 to 0.17; Table 6). Third, on-chain subsidy intensity correlates with concentration in levels (r = 0.57, p = 0.008, N = 20) but entirely through Livepeer (88.5x subsidy): excluding Livepeer, the correlation is not significant (r = 0.11, p = 0.65). Fourth, delegation amplifies concentration unevenly: voting-power HHI reaches 3 to 6 times holding HHI in DePIN, while two infrastructure protocols diverge (Optimism 0.79x, Arbitrum 4.3x), consistent with institutional design at the operator and router level shaping governance outcomes more than sector classification alone.</w:t>
-      </w:r>
-    </w:p>
-    <w:p>
-      <w:r>
-        <w:t>These findings rest on a measurement distinction often conflated in the literature. Token inequality (Gini, dispersion across all holders) and governance concentration (HHI, sum of squared shares across top holders) capture distinct properties of the same holder set. Inequality is severe in every protocol (Gini 0.52 to 0.99), while concentration varies across two orders of magnitude (HHI 0.005 to 0.199); their moderate correlation (r = 0.51) shows that inequality metrics cannot substitute for direct concentration measurement.</w:t>
+        <w:t>Initial token allocation design does not predict governance concentration. A 40-protocol cross-section spanning Decentralized Physical Infrastructure Networks (DePIN), DeFi, infrastructure, and social token categories documents that team and investor allocation at launch is uninformative about post-distribution governance concentration (Pearson r = 0.18, p = 0.28, N = 37): protocols with generous community distributions exhibit concentration patterns similar to those with heavy insider allocations. Hyperliquid (zero venture capital, 31% community airdrop) shows the lowest DeFi-subsample Herfindahl-Hirschman Index (HHI) of 0.005, but the broader null holds across allocation designs. Evidence is consistent with post-distribution market dynamics shaping concentration more than initial structural design.</w:t>
+      </w:r>
+    </w:p>
+    <w:p>
+      <w:r>
+        <w:t>Four supporting findings sharpen the picture. First, protocols with more insider wallets in their top-holder sets exhibit higher concentration among non-insider holders (Spearman rho = 0.54, p = 0.001, N = 34): insider-heavy protocols develop concentrated governance ecosystems, not merely concentrated insider positions. Second, sector membership predicts concentration: DePIN exceeds DeFi (Mann-Whitney p = 0.014, Cohen’s d = 1.03), and the effect survives across three nested OLS specifications adding protocol age, log fully diluted valuation (FDV), and initial insider allocation as successive controls (sector coefficient p &lt; 0.05 in Models 1 and 2, borderline at p = 0.050 in Model 3 with the full control set; adjusted R² 0.14 to 0.17; Table 6). Third, on-chain subsidy intensity correlates with concentration in levels (r = 0.57, p = 0.008, N = 20) but entirely through Livepeer (88.5x subsidy); excluding Livepeer yields r = 0.11, p = 0.65. Fourth, delegation amplifies concentration unevenly: voting-power HHI reaches 3 to 6 times holding HHI in DePIN, while two infrastructure protocols diverge (Optimism 0.79x, Arbitrum 4.3x); operator and router design shape outcomes beyond sector classification alone.</w:t>
+      </w:r>
+    </w:p>
+    <w:p>
+      <w:r>
+        <w:t>A measurement distinction underlies these findings. Token inequality (Gini, dispersion across all holders) and governance concentration (HHI, sum of squared top-holder shares) capture distinct properties of the same holder set. Inequality is severe in every protocol (Gini 0.52 to 0.99), while concentration varies across two orders of magnitude (HHI 0.005 to 0.199); the moderate correlation (r = 0.51) confirms that inequality metrics cannot substitute for direct concentration measurement.</w:t>
       </w:r>
     </w:p>
     <w:p>

</xml_diff>

<commit_message>
B2 tracked-changes: 42-word abstract cut visible as revision-marker redline
</commit_message>
<xml_diff>
--- a/b2/paper/B2_Frontiers_R1_tracked_changes.docx
+++ b/b2/paper/B2_Frontiers_R1_tracked_changes.docx
@@ -67,19 +67,40 @@
       </w:r>
     </w:p>
     <w:p>
-      <w:r>
-        <w:t>Initial token allocation design does not predict governance concentration. A 40-protocol cross-section spanning Decentralized Physical Infrastructure Networks (DePIN), DeFi, infrastructure, and social token categories documents that team and investor allocation at launch is uninformative about post-distribution governance concentration (Pearson r = 0.18, p = 0.28, N = 37): protocols with generous community distributions exhibit concentration patterns similar to those with heavy insider allocations. Hyperliquid (zero venture capital, 31% community airdrop) shows the lowest DeFi-subsample Herfindahl-Hirschman Index (HHI) of 0.005, but the broader null holds across allocation designs. Evidence is consistent with post-distribution market dynamics shaping concentration more than initial structural design.</w:t>
-      </w:r>
-    </w:p>
-    <w:p>
-      <w:r>
-        <w:t>Four supporting findings sharpen the picture. First, protocols with more insider wallets in their top-holder sets exhibit higher concentration among non-insider holders (Spearman rho = 0.54, p = 0.001, N = 34): insider-heavy protocols develop concentrated governance ecosystems, not merely concentrated insider positions. Second, sector membership predicts concentration: DePIN exceeds DeFi (Mann-Whitney p = 0.014, Cohen’s d = 1.03), and the effect survives across three nested OLS specifications adding protocol age, log fully diluted valuation (FDV), and initial insider allocation as successive controls (sector coefficient p &lt; 0.05 in Models 1 and 2, borderline at p = 0.050 in Model 3 with the full control set; adjusted R² 0.14 to 0.17; Table 6). Third, on-chain subsidy intensity correlates with concentration in levels (r = 0.57, p = 0.008, N = 20) but entirely through Livepeer (88.5x subsidy); excluding Livepeer yields r = 0.11, p = 0.65. Fourth, delegation amplifies concentration unevenly: voting-power HHI reaches 3 to 6 times holding HHI in DePIN, while two infrastructure protocols diverge (Optimism 0.79x, Arbitrum 4.3x); operator and router design shape outcomes beyond sector classification alone.</w:t>
-      </w:r>
-    </w:p>
-    <w:p>
-      <w:r>
-        <w:t>A measurement distinction underlies these findings. Token inequality (Gini, dispersion across all holders) and governance concentration (HHI, sum of squared top-holder shares) capture distinct properties of the same holder set. Inequality is severe in every protocol (Gini 0.52 to 0.99), while concentration varies across two orders of magnitude (HHI 0.005 to 0.199); the moderate correlation (r = 0.51) confirms that inequality metrics cannot substitute for direct concentration measurement.</w:t>
-      </w:r>
+      <w:del w:id="2001" w:author="Zach Zukowski (F1 final precision)" w:date="2026-05-12T00:00:00Z">
+        <w:r>
+          <w:delText xml:space="preserve">Initial token allocation design does not predict governance concentration. A 40-protocol cross-section spanning Decentralized Physical Infrastructure Networks (DePIN), DeFi, infrastructure, and social token categories documents that the percentage of tokens allocated to team and investors at launch is uninformative about post-distribution governance concentration (Pearson r = 0.18, p = 0.28, N = 37): protocols with generous community distributions exhibit concentration patterns similar to those with heavy insider allocations. Hyperliquid, the only protocol in the sample with zero venture capital and a 31% community airdrop, shows the lowest DeFi-subsample Herfindahl-Hirschman Index (HHI) of 0.005, but the broader null holds across allocation designs. Evidence is consistent with post-distribution market dynamics shaping concentration more than initial structural design.</w:delText>
+        </w:r>
+      </w:del>
+      <w:ins w:id="2002" w:author="Zach Zukowski (F1 final precision)" w:date="2026-05-12T00:00:00Z">
+        <w:r>
+          <w:t xml:space="preserve">Initial token allocation design does not predict governance concentration. A 40-protocol cross-section spanning Decentralized Physical Infrastructure Networks (DePIN), DeFi, infrastructure, and social token categories documents that team and investor allocation at launch is uninformative about post-distribution governance concentration (Pearson r = 0.18, p = 0.28, N = 37): protocols with generous community distributions exhibit concentration patterns similar to those with heavy insider allocations. Hyperliquid (zero venture capital, 31% community airdrop) shows the lowest DeFi-subsample Herfindahl-Hirschman Index (HHI) of 0.005, but the broader null holds across allocation designs. Evidence is consistent with post-distribution market dynamics shaping concentration more than initial structural design.</w:t>
+        </w:r>
+      </w:ins>
+    </w:p>
+    <w:p>
+      <w:del w:id="2003" w:author="Zach Zukowski (F1 final precision)" w:date="2026-05-12T00:00:00Z">
+        <w:r>
+          <w:delText xml:space="preserve">Four supporting findings sharpen the picture. First, protocols with more insider wallets in their top-holder sets exhibit higher concentration among non-insider holders (Spearman rho = 0.54, p = 0.001, N = 34), indicating that insider-heavy protocols develop concentrated governance ecosystems, not merely concentrated insider positions. Second, sector membership predicts concentration: DePIN protocols are more concentrated than DeFi (Mann-Whitney p = 0.014, Cohen’s d = 1.03), and the effect survives multivariate OLS adjustment across three nested specifications adding protocol age, log fully diluted valuation (FDV), and initial insider allocation as successive controls (sector coefficient p &lt; 0.05 in Models 1 and 2, borderline at p = 0.050 in Model 3 with the full control set; adjusted R² 0.14 to 0.17; Table 6). Third, on-chain subsidy intensity correlates with concentration in levels (r = 0.57, p = 0.008, N = 20) but entirely through Livepeer (88.5x subsidy): excluding Livepeer, the correlation is not significant (r = 0.11, p = 0.65). Fourth, delegation amplifies concentration unevenly: voting-power HHI reaches 3 to 6 times holding HHI in DePIN, while two infrastructure protocols diverge (Optimism 0.79x, Arbitrum 4.3x), consistent with institutional design at the operator and router level shaping governance outcomes more than sector classification alone.</w:delText>
+        </w:r>
+      </w:del>
+      <w:ins w:id="2004" w:author="Zach Zukowski (F1 final precision)" w:date="2026-05-12T00:00:00Z">
+        <w:r>
+          <w:t xml:space="preserve">Four supporting findings sharpen the picture. First, protocols with more insider wallets in their top-holder sets exhibit higher concentration among non-insider holders (Spearman rho = 0.54, p = 0.001, N = 34): insider-heavy protocols develop concentrated governance ecosystems, not merely concentrated insider positions. Second, sector membership predicts concentration: DePIN exceeds DeFi (Mann-Whitney p = 0.014, Cohen’s d = 1.03), and the effect survives across three nested OLS specifications adding protocol age, log fully diluted valuation (FDV), and initial insider allocation as successive controls (sector coefficient p &lt; 0.05 in Models 1 and 2, borderline at p = 0.050 in Model 3 with the full control set; adjusted R² 0.14 to 0.17; Table 6). Third, on-chain subsidy intensity correlates with concentration in levels (r = 0.57, p = 0.008, N = 20) but entirely through Livepeer (88.5x subsidy); excluding Livepeer yields r = 0.11, p = 0.65. Fourth, delegation amplifies concentration unevenly: voting-power HHI reaches 3 to 6 times holding HHI in DePIN, while two infrastructure protocols diverge (Optimism 0.79x, Arbitrum 4.3x); operator and router design shape outcomes beyond sector classification alone.</w:t>
+        </w:r>
+      </w:ins>
+    </w:p>
+    <w:p>
+      <w:del w:id="2005" w:author="Zach Zukowski (F1 final precision)" w:date="2026-05-12T00:00:00Z">
+        <w:r>
+          <w:delText xml:space="preserve">These findings rest on a measurement distinction often conflated in the literature. Token inequality (Gini, dispersion across all holders) and governance concentration (HHI, sum of squared shares across top holders) capture distinct properties of the same holder set. Inequality is severe in every protocol (Gini 0.52 to 0.99), while concentration varies across two orders of magnitude (HHI 0.005 to 0.199); their moderate correlation (r = 0.51) shows that inequality metrics cannot substitute for direct concentration measurement.</w:delText>
+        </w:r>
+      </w:del>
+      <w:ins w:id="2006" w:author="Zach Zukowski (F1 final precision)" w:date="2026-05-12T00:00:00Z">
+        <w:r>
+          <w:t xml:space="preserve">A measurement distinction underlies these findings. Token inequality (Gini, dispersion across all holders) and governance concentration (HHI, sum of squared top-holder shares) capture distinct properties of the same holder set. Inequality is severe in every protocol (Gini 0.52 to 0.99), while concentration varies across two orders of magnitude (HHI 0.005 to 0.199); the moderate correlation (r = 0.51) confirms that inequality metrics cannot substitute for direct concentration measurement.</w:t>
+        </w:r>
+      </w:ins>
     </w:p>
     <w:p>
       <w:pPr>

</xml_diff>

<commit_message>
B2 metadata polish: JEL O33 add + keyword swap (paper refresh + CITATION sync)
</commit_message>
<xml_diff>
--- a/b2/paper/B2_Frontiers_R1_tracked_changes.docx
+++ b/b2/paper/B2_Frontiers_R1_tracked_changes.docx
@@ -114,7 +114,17 @@
       </w:r>
       <w:r>
         <w:rPr/>
-        <w:t>C21, D02, D47, D63, D71, D72, G34, L22, P48</w:t>
+        <w:t>C21, D02, D47, D63, D71, D72, G34, L22, </w:t>
+      </w:r>
+      <w:ins w:id="2007" w:author="Zach Zukowski (F1 final precision)" w:date="2026-05-12T00:00:00Z">
+        <w:r>
+          <w:rPr/>
+          <w:t>O33, </w:t>
+        </w:r>
+      </w:ins>
+      <w:r>
+        <w:rPr/>
+        <w:t>P48</w:t>
       </w:r>
     </w:p>
     <w:p>
@@ -122,10 +132,20 @@
         <w:spacing w:before="240"/>
       </w:pPr>
       <w:r>
-        <w:rPr>
-          <w:b/>
-        </w:rPr>
-        <w:t>Keywords: tokenomics, institutional design, governance concentration, DAO governance, DePIN, delegation amplification, Herfindahl-Hirschman Index, political philosophy of institutions, polycentric governance, exclusion methodology</w:t>
+        <w:t>Keywords: tokenomics, institutional design, governance concentration, DAO governance, DePIN, delegation amplification, Herfindahl-Hirschman Index, </w:t>
+      </w:r>
+      <w:del w:id="2008" w:author="Zach Zukowski (F1 final precision)" w:date="2026-05-12T00:00:00Z">
+        <w:r>
+          <w:delText xml:space="preserve">political philosophy of institutions</w:delText>
+        </w:r>
+      </w:del>
+      <w:ins w:id="2009" w:author="Zach Zukowski (F1 final precision)" w:date="2026-05-12T00:00:00Z">
+        <w:r>
+          <w:t xml:space="preserve">burn-rule exclusion</w:t>
+        </w:r>
+      </w:ins>
+      <w:r>
+        <w:t>, polycentric governance, exclusion methodology</w:t>
       </w:r>
       <w:r>
         <w:rPr/>

</xml_diff>